<commit_message>
JAPOKO detalus planas DOCX (Google Docs importui)
</commit_message>
<xml_diff>
--- a/JAPOKO-automatizaciju-planas-detalus.docx
+++ b/JAPOKO-automatizaciju-planas-detalus.docx
@@ -9,7 +9,7 @@
       <w:r>
         <w:rPr>
           <w:b/>
-          <w:color w:val="C21A1A"/>
+          <w:color w:val="D21F34"/>
           <w:sz w:val="60"/>
         </w:rPr>
         <w:t>JAPOKO</w:t>
@@ -21,7 +21,7 @@
       </w:pPr>
       <w:r>
         <w:rPr>
-          <w:color w:val="231F20"/>
+          <w:color w:val="201A17"/>
           <w:sz w:val="30"/>
         </w:rPr>
         <w:t>Automatizacijų laiškų planas - detalus</w:t>
@@ -44,7 +44,7 @@
       <w:r>
         <w:rPr>
           <w:b/>
-          <w:color w:val="C21A1A"/>
+          <w:color w:val="D21F34"/>
           <w:sz w:val="32"/>
         </w:rPr>
         <w:t>Trumpai, kaip skaityti šį dokumentą</w:t>
@@ -169,7 +169,7 @@
       <w:r>
         <w:rPr>
           <w:b/>
-          <w:color w:val="C21A1A"/>
+          <w:color w:val="D21F34"/>
           <w:sz w:val="32"/>
         </w:rPr>
         <w:t>1. Welcome serija - 3 laiškai</w:t>
@@ -201,7 +201,7 @@
       <w:r>
         <w:rPr>
           <w:b/>
-          <w:color w:val="231F20"/>
+          <w:color w:val="201A17"/>
           <w:sz w:val="26"/>
         </w:rPr>
         <w:t>E1 - „Sveiki atvykę į JAPOKO“</w:t>
@@ -325,7 +325,7 @@
       <w:r>
         <w:rPr>
           <w:b/>
-          <w:color w:val="C21A1A"/>
+          <w:color w:val="D21F34"/>
         </w:rPr>
         <w:t>Realus tekstas (Metodijos balsu):</w:t>
       </w:r>
@@ -446,7 +446,7 @@
       <w:r>
         <w:rPr>
           <w:b/>
-          <w:color w:val="231F20"/>
+          <w:color w:val="201A17"/>
           <w:sz w:val="26"/>
         </w:rPr>
         <w:t>E2 - „Kas čia kitaip?“</w:t>
@@ -562,7 +562,7 @@
       <w:r>
         <w:rPr>
           <w:b/>
-          <w:color w:val="C21A1A"/>
+          <w:color w:val="D21F34"/>
         </w:rPr>
         <w:t>Realus tekstas (Metodijos balsu):</w:t>
       </w:r>
@@ -672,7 +672,7 @@
       <w:r>
         <w:rPr>
           <w:b/>
-          <w:color w:val="231F20"/>
+          <w:color w:val="201A17"/>
           <w:sz w:val="26"/>
         </w:rPr>
         <w:t>E3 - „Jei dar norisi pagalvoti“</w:t>
@@ -788,7 +788,7 @@
       <w:r>
         <w:rPr>
           <w:b/>
-          <w:color w:val="C21A1A"/>
+          <w:color w:val="D21F34"/>
         </w:rPr>
         <w:t>Realus tekstas (Metodijos balsu):</w:t>
       </w:r>
@@ -898,7 +898,7 @@
       <w:r>
         <w:rPr>
           <w:b/>
-          <w:color w:val="C21A1A"/>
+          <w:color w:val="D21F34"/>
           <w:sz w:val="32"/>
         </w:rPr>
         <w:t>2. Palikto krepšelio serija - 3 laiškai</w:t>
@@ -930,7 +930,7 @@
       <w:r>
         <w:rPr>
           <w:b/>
-          <w:color w:val="231F20"/>
+          <w:color w:val="201A17"/>
           <w:sz w:val="26"/>
         </w:rPr>
         <w:t>E1 - draugiškas priminimas</w:t>
@@ -1054,7 +1054,7 @@
       <w:r>
         <w:rPr>
           <w:b/>
-          <w:color w:val="C21A1A"/>
+          <w:color w:val="D21F34"/>
         </w:rPr>
         <w:t>Realus tekstas (Metodijos balsu):</w:t>
       </w:r>
@@ -1142,7 +1142,7 @@
       <w:r>
         <w:rPr>
           <w:b/>
-          <w:color w:val="231F20"/>
+          <w:color w:val="201A17"/>
           <w:sz w:val="26"/>
         </w:rPr>
         <w:t>E2 - kodėl verta būtent tai</w:t>
@@ -1266,7 +1266,7 @@
       <w:r>
         <w:rPr>
           <w:b/>
-          <w:color w:val="C21A1A"/>
+          <w:color w:val="D21F34"/>
         </w:rPr>
         <w:t>Realus tekstas (Metodijos balsu):</w:t>
       </w:r>
@@ -1365,7 +1365,7 @@
       <w:r>
         <w:rPr>
           <w:b/>
-          <w:color w:val="231F20"/>
+          <w:color w:val="201A17"/>
           <w:sz w:val="26"/>
         </w:rPr>
         <w:t>E3 - pagalba + švelni nuolaida</w:t>
@@ -1489,7 +1489,7 @@
       <w:r>
         <w:rPr>
           <w:b/>
-          <w:color w:val="C21A1A"/>
+          <w:color w:val="D21F34"/>
         </w:rPr>
         <w:t>Realus tekstas (Metodijos balsu):</w:t>
       </w:r>
@@ -1599,7 +1599,7 @@
       <w:r>
         <w:rPr>
           <w:b/>
-          <w:color w:val="C21A1A"/>
+          <w:color w:val="D21F34"/>
           <w:sz w:val="32"/>
         </w:rPr>
         <w:t>3. Palikto atsiskaitymo lango serija - 3 laiškai</w:t>
@@ -1631,7 +1631,7 @@
       <w:r>
         <w:rPr>
           <w:b/>
-          <w:color w:val="231F20"/>
+          <w:color w:val="201A17"/>
           <w:sz w:val="26"/>
         </w:rPr>
         <w:t>E1 - beveik baigėte</w:t>
@@ -1747,7 +1747,7 @@
       <w:r>
         <w:rPr>
           <w:b/>
-          <w:color w:val="C21A1A"/>
+          <w:color w:val="D21F34"/>
         </w:rPr>
         <w:t>Realus tekstas (Metodijos balsu):</w:t>
       </w:r>
@@ -1835,7 +1835,7 @@
       <w:r>
         <w:rPr>
           <w:b/>
-          <w:color w:val="231F20"/>
+          <w:color w:val="201A17"/>
           <w:sz w:val="26"/>
         </w:rPr>
         <w:t>E2 - ar kilo klausimų atsiskaitant</w:t>
@@ -1951,7 +1951,7 @@
       <w:r>
         <w:rPr>
           <w:b/>
-          <w:color w:val="C21A1A"/>
+          <w:color w:val="D21F34"/>
         </w:rPr>
         <w:t>Realus tekstas (Metodijos balsu):</w:t>
       </w:r>
@@ -2050,7 +2050,7 @@
       <w:r>
         <w:rPr>
           <w:b/>
-          <w:color w:val="231F20"/>
+          <w:color w:val="201A17"/>
           <w:sz w:val="26"/>
         </w:rPr>
         <w:t>E3 - prekės vis dar laukia</w:t>
@@ -2166,7 +2166,7 @@
       <w:r>
         <w:rPr>
           <w:b/>
-          <w:color w:val="C21A1A"/>
+          <w:color w:val="D21F34"/>
         </w:rPr>
         <w:t>Realus tekstas (Metodijos balsu):</w:t>
       </w:r>
@@ -2265,7 +2265,7 @@
       <w:r>
         <w:rPr>
           <w:b/>
-          <w:color w:val="C21A1A"/>
+          <w:color w:val="D21F34"/>
           <w:sz w:val="32"/>
         </w:rPr>
         <w:t>4. Palikto produkto (peržiūros) serija - 2 laiškai</w:t>
@@ -2297,7 +2297,7 @@
       <w:r>
         <w:rPr>
           <w:b/>
-          <w:color w:val="231F20"/>
+          <w:color w:val="201A17"/>
           <w:sz w:val="26"/>
         </w:rPr>
         <w:t>E1 - užkliuvo šis produktas?</w:t>
@@ -2421,7 +2421,7 @@
       <w:r>
         <w:rPr>
           <w:b/>
-          <w:color w:val="C21A1A"/>
+          <w:color w:val="D21F34"/>
         </w:rPr>
         <w:t>Realus tekstas (Metodijos balsu):</w:t>
       </w:r>
@@ -2520,7 +2520,7 @@
       <w:r>
         <w:rPr>
           <w:b/>
-          <w:color w:val="231F20"/>
+          <w:color w:val="201A17"/>
           <w:sz w:val="26"/>
         </w:rPr>
         <w:t>E2 - galbūt ir šie patiktų</w:t>
@@ -2644,7 +2644,7 @@
       <w:r>
         <w:rPr>
           <w:b/>
-          <w:color w:val="C21A1A"/>
+          <w:color w:val="D21F34"/>
         </w:rPr>
         <w:t>Realus tekstas (Metodijos balsu):</w:t>
       </w:r>
@@ -2732,7 +2732,7 @@
       <w:r>
         <w:rPr>
           <w:b/>
-          <w:color w:val="C21A1A"/>
+          <w:color w:val="D21F34"/>
           <w:sz w:val="32"/>
         </w:rPr>
         <w:t>5. Naršymo serija - 1 laiškas</w:t>
@@ -2775,7 +2775,7 @@
       <w:r>
         <w:rPr>
           <w:b/>
-          <w:color w:val="231F20"/>
+          <w:color w:val="201A17"/>
           <w:sz w:val="26"/>
         </w:rPr>
         <w:t>E1 - ko šiuo metu ieškote?</w:t>
@@ -2891,7 +2891,7 @@
       <w:r>
         <w:rPr>
           <w:b/>
-          <w:color w:val="C21A1A"/>
+          <w:color w:val="D21F34"/>
         </w:rPr>
         <w:t>Realus tekstas (Metodijos balsu):</w:t>
       </w:r>
@@ -2990,7 +2990,7 @@
       <w:r>
         <w:rPr>
           <w:b/>
-          <w:color w:val="C21A1A"/>
+          <w:color w:val="D21F34"/>
           <w:sz w:val="32"/>
         </w:rPr>
         <w:t>6. Atsiliepimų serija - 1 laiškas</w:t>
@@ -3033,7 +3033,7 @@
       <w:r>
         <w:rPr>
           <w:b/>
-          <w:color w:val="231F20"/>
+          <w:color w:val="201A17"/>
           <w:sz w:val="26"/>
         </w:rPr>
         <w:t>E1 - kaip Jums?</w:t>
@@ -3149,7 +3149,7 @@
       <w:r>
         <w:rPr>
           <w:b/>
-          <w:color w:val="C21A1A"/>
+          <w:color w:val="D21F34"/>
         </w:rPr>
         <w:t>Realus tekstas (Metodijos balsu):</w:t>
       </w:r>
@@ -3248,7 +3248,7 @@
       <w:r>
         <w:rPr>
           <w:b/>
-          <w:color w:val="C21A1A"/>
+          <w:color w:val="D21F34"/>
           <w:sz w:val="32"/>
         </w:rPr>
         <w:t>7. Win-back serija - 3 laiškai</w:t>
@@ -3280,7 +3280,7 @@
       <w:r>
         <w:rPr>
           <w:b/>
-          <w:color w:val="231F20"/>
+          <w:color w:val="201A17"/>
           <w:sz w:val="26"/>
         </w:rPr>
         <w:t>E1 - seniai matėmės</w:t>
@@ -3404,7 +3404,7 @@
       <w:r>
         <w:rPr>
           <w:b/>
-          <w:color w:val="C21A1A"/>
+          <w:color w:val="D21F34"/>
         </w:rPr>
         <w:t>Realus tekstas (Metodijos balsu):</w:t>
       </w:r>
@@ -3492,7 +3492,7 @@
       <w:r>
         <w:rPr>
           <w:b/>
-          <w:color w:val="231F20"/>
+          <w:color w:val="201A17"/>
           <w:sz w:val="26"/>
         </w:rPr>
         <w:t>E2 - gal ieškote dovanos?</w:t>
@@ -3616,7 +3616,7 @@
       <w:r>
         <w:rPr>
           <w:b/>
-          <w:color w:val="C21A1A"/>
+          <w:color w:val="D21F34"/>
         </w:rPr>
         <w:t>Realus tekstas (Metodijos balsu):</w:t>
       </w:r>
@@ -3726,7 +3726,7 @@
       <w:r>
         <w:rPr>
           <w:b/>
-          <w:color w:val="231F20"/>
+          <w:color w:val="201A17"/>
           <w:sz w:val="26"/>
         </w:rPr>
         <w:t>E3 - ar norite likti?</w:t>
@@ -3850,7 +3850,7 @@
       <w:r>
         <w:rPr>
           <w:b/>
-          <w:color w:val="C21A1A"/>
+          <w:color w:val="D21F34"/>
         </w:rPr>
         <w:t>Realus tekstas (Metodijos balsu):</w:t>
       </w:r>
@@ -3938,7 +3938,7 @@
       <w:r>
         <w:rPr>
           <w:b/>
-          <w:color w:val="C21A1A"/>
+          <w:color w:val="D21F34"/>
           <w:sz w:val="32"/>
         </w:rPr>
         <w:t>Ką reikia patvirtinti prieš statant</w:t>
@@ -4391,7 +4391,7 @@
     <w:rsid w:val="00FC693F"/>
     <w:rPr>
       <w:rFonts w:ascii="Calibri" w:hAnsi="Calibri"/>
-      <w:color w:val="231F20"/>
+      <w:color w:val="201A17"/>
       <w:sz w:val="22"/>
     </w:rPr>
   </w:style>

</xml_diff>